<commit_message>
feat(sprint-2): módulos financeiro e importação, tela de upload, wireframes como base de navegação
- api: módulo financeiro (CRUD de Parcela, sem exclusão - append-first)
- api: módulo importacao (parser xlsx, processor com upsert incremental
  aluno/curso/matricula/parcela, fila BullMQ, histórico de Importacao)
- api: migration inicial do Prisma aplicada
- web: tela de upload/acompanhamento de importação; shell trocado para
  menu em abas horizontais seguindo a estrutura dos wireframes
- infra: redis e evolution-api removidos do docker-compose (decisão do
  usuário) - fila de importação fica sem broker local, ver PENDENCIAS.md
- docs: PENDENCIAS.md e TASK.md atualizados com decisões e pendências
</commit_message>
<xml_diff>
--- a/docs/especificacao/EthosFinancial_1.0_Especificacao.docx
+++ b/docs/especificacao/EthosFinancial_1.0_Especificacao.docx
@@ -16483,6 +16483,521 @@
           <w:sz w:val="30"/>
           <w:szCs w:val="30"/>
         </w:rPr>
+        <w:t xml:space="preserve">Wireframes das Telas Principais</w:t>
+      </w:r>
+    </w:p>
+    <w:p>
+      <w:pPr>
+        <w:spacing w:after="140" w:line="300"/>
+      </w:pPr>
+      <w:r>
+        <w:rPr>
+          <w:rFonts w:ascii="Calibri" w:cs="Calibri" w:eastAsia="Calibri" w:hAnsi="Calibri"/>
+          <w:color w:val="1A1A1A"/>
+          <w:sz w:val="21"/>
+          <w:szCs w:val="21"/>
+        </w:rPr>
+        <w:t xml:space="preserve">Os wireframes abaixo ilustram, em baixa fidelidade, a estrutura e o comportamento esperado das telas centrais do EthosFinancial. O objetivo é alinhar navegação, hierarquia de informação e principais interações antes da implementação visual definitiva (identidade visual, cores de marca e refinamento de UI ficam a cargo do time de design).</w:t>
+      </w:r>
+    </w:p>
+    <w:p>
+      <w:pPr>
+        <w:pStyle w:val="Heading3"/>
+        <w:spacing w:after="100" w:before="200"/>
+      </w:pPr>
+      <w:r>
+        <w:rPr>
+          <w:rFonts w:ascii="Calibri" w:cs="Calibri" w:eastAsia="Calibri" w:hAnsi="Calibri"/>
+          <w:b/>
+          <w:bCs/>
+          <w:color w:val="1A1A1A"/>
+          <w:sz w:val="22"/>
+          <w:szCs w:val="22"/>
+        </w:rPr>
+        <w:t xml:space="preserve">24.1 Dashboard geral</w:t>
+      </w:r>
+    </w:p>
+    <w:p>
+      <w:pPr>
+        <w:spacing w:after="140" w:line="300"/>
+      </w:pPr>
+      <w:r>
+        <w:rPr>
+          <w:rFonts w:ascii="Calibri" w:cs="Calibri" w:eastAsia="Calibri" w:hAnsi="Calibri"/>
+          <w:color w:val="1A1A1A"/>
+          <w:sz w:val="21"/>
+          <w:szCs w:val="21"/>
+        </w:rPr>
+        <w:t xml:space="preserve">Visão consolidada de indicadores (alunos, inadimplência, valores vencidos) e gráficos de acompanhamento mensal e por curso.</w:t>
+      </w:r>
+    </w:p>
+    <w:p>
+      <w:pPr>
+        <w:spacing w:after="80" w:before="200"/>
+        <w:jc w:val="center"/>
+      </w:pPr>
+      <w:r>
+        <w:drawing>
+          <wp:inline distT="0" distB="0" distL="0" distR="0">
+            <wp:extent cx="5715000" cy="3724275"/>
+            <wp:effectExtent t="0" r="0" b="0" l="0"/>
+            <wp:docPr id="1" name="" descr="" title=""/>
+            <wp:cNvGraphicFramePr>
+              <a:graphicFrameLocks xmlns:a="http://schemas.openxmlformats.org/drawingml/2006/main" noChangeAspect="1"/>
+            </wp:cNvGraphicFramePr>
+            <a:graphic xmlns:a="http://schemas.openxmlformats.org/drawingml/2006/main">
+              <a:graphicData uri="http://schemas.openxmlformats.org/drawingml/2006/picture">
+                <pic:pic xmlns:pic="http://schemas.openxmlformats.org/drawingml/2006/picture">
+                  <pic:nvPicPr>
+                    <pic:cNvPr id="0" name="" descr=""/>
+                    <pic:cNvPicPr>
+                      <a:picLocks noChangeAspect="1" noChangeArrowheads="1"/>
+                    </pic:cNvPicPr>
+                  </pic:nvPicPr>
+                  <pic:blipFill>
+                    <a:blip r:embed="rId9" cstate="none"/>
+                    <a:srcRect/>
+                    <a:stretch>
+                      <a:fillRect/>
+                    </a:stretch>
+                  </pic:blipFill>
+                  <pic:spPr bwMode="auto">
+                    <a:xfrm>
+                      <a:off x="0" y="0"/>
+                      <a:ext cx="5715000" cy="3724275"/>
+                    </a:xfrm>
+                    <a:prstGeom prst="rect">
+                      <a:avLst/>
+                    </a:prstGeom>
+                  </pic:spPr>
+                </pic:pic>
+              </a:graphicData>
+            </a:graphic>
+          </wp:inline>
+        </w:drawing>
+      </w:r>
+    </w:p>
+    <w:p>
+      <w:pPr>
+        <w:spacing w:after="260"/>
+        <w:jc w:val="center"/>
+      </w:pPr>
+      <w:r>
+        <w:rPr>
+          <w:rFonts w:ascii="Calibri" w:cs="Calibri" w:eastAsia="Calibri" w:hAnsi="Calibri"/>
+          <w:i/>
+          <w:iCs/>
+          <w:color w:val="595959"/>
+          <w:sz w:val="18"/>
+          <w:szCs w:val="18"/>
+        </w:rPr>
+        <w:t xml:space="preserve">Dashboard geral — indicadores e gráficos de inadimplência</w:t>
+      </w:r>
+    </w:p>
+    <w:p>
+      <w:pPr>
+        <w:pStyle w:val="Heading3"/>
+        <w:spacing w:after="100" w:before="200"/>
+      </w:pPr>
+      <w:r>
+        <w:rPr>
+          <w:rFonts w:ascii="Calibri" w:cs="Calibri" w:eastAsia="Calibri" w:hAnsi="Calibri"/>
+          <w:b/>
+          <w:bCs/>
+          <w:color w:val="1A1A1A"/>
+          <w:sz w:val="22"/>
+          <w:szCs w:val="22"/>
+        </w:rPr>
+        <w:t xml:space="preserve">24.2 Listagem de Alunos</w:t>
+      </w:r>
+    </w:p>
+    <w:p>
+      <w:pPr>
+        <w:spacing w:after="140" w:line="300"/>
+      </w:pPr>
+      <w:r>
+        <w:rPr>
+          <w:rFonts w:ascii="Calibri" w:cs="Calibri" w:eastAsia="Calibri" w:hAnsi="Calibri"/>
+          <w:color w:val="1A1A1A"/>
+          <w:sz w:val="21"/>
+          <w:szCs w:val="21"/>
+        </w:rPr>
+        <w:t xml:space="preserve">Busca e filtros (nome, CPF, cidade, estado) com tabela de resultados exibindo situação de inadimplência por aluno.</w:t>
+      </w:r>
+    </w:p>
+    <w:p>
+      <w:pPr>
+        <w:spacing w:after="80" w:before="200"/>
+        <w:jc w:val="center"/>
+      </w:pPr>
+      <w:r>
+        <w:drawing>
+          <wp:inline distT="0" distB="0" distL="0" distR="0">
+            <wp:extent cx="5715000" cy="2657475"/>
+            <wp:effectExtent t="0" r="0" b="0" l="0"/>
+            <wp:docPr id="1" name="" descr="" title=""/>
+            <wp:cNvGraphicFramePr>
+              <a:graphicFrameLocks xmlns:a="http://schemas.openxmlformats.org/drawingml/2006/main" noChangeAspect="1"/>
+            </wp:cNvGraphicFramePr>
+            <a:graphic xmlns:a="http://schemas.openxmlformats.org/drawingml/2006/main">
+              <a:graphicData uri="http://schemas.openxmlformats.org/drawingml/2006/picture">
+                <pic:pic xmlns:pic="http://schemas.openxmlformats.org/drawingml/2006/picture">
+                  <pic:nvPicPr>
+                    <pic:cNvPr id="0" name="" descr=""/>
+                    <pic:cNvPicPr>
+                      <a:picLocks noChangeAspect="1" noChangeArrowheads="1"/>
+                    </pic:cNvPicPr>
+                  </pic:nvPicPr>
+                  <pic:blipFill>
+                    <a:blip r:embed="rId10" cstate="none"/>
+                    <a:srcRect/>
+                    <a:stretch>
+                      <a:fillRect/>
+                    </a:stretch>
+                  </pic:blipFill>
+                  <pic:spPr bwMode="auto">
+                    <a:xfrm>
+                      <a:off x="0" y="0"/>
+                      <a:ext cx="5715000" cy="2657475"/>
+                    </a:xfrm>
+                    <a:prstGeom prst="rect">
+                      <a:avLst/>
+                    </a:prstGeom>
+                  </pic:spPr>
+                </pic:pic>
+              </a:graphicData>
+            </a:graphic>
+          </wp:inline>
+        </w:drawing>
+      </w:r>
+    </w:p>
+    <w:p>
+      <w:pPr>
+        <w:spacing w:after="260"/>
+        <w:jc w:val="center"/>
+      </w:pPr>
+      <w:r>
+        <w:rPr>
+          <w:rFonts w:ascii="Calibri" w:cs="Calibri" w:eastAsia="Calibri" w:hAnsi="Calibri"/>
+          <w:i/>
+          <w:iCs/>
+          <w:color w:val="595959"/>
+          <w:sz w:val="18"/>
+          <w:szCs w:val="18"/>
+        </w:rPr>
+        <w:t xml:space="preserve">Listagem de alunos com busca, filtros e situação</w:t>
+      </w:r>
+    </w:p>
+    <w:p>
+      <w:pPr>
+        <w:pStyle w:val="Heading3"/>
+        <w:spacing w:after="100" w:before="200"/>
+      </w:pPr>
+      <w:r>
+        <w:rPr>
+          <w:rFonts w:ascii="Calibri" w:cs="Calibri" w:eastAsia="Calibri" w:hAnsi="Calibri"/>
+          <w:b/>
+          <w:bCs/>
+          <w:color w:val="1A1A1A"/>
+          <w:sz w:val="22"/>
+          <w:szCs w:val="22"/>
+        </w:rPr>
+        <w:t xml:space="preserve">24.3 Importação de Planilha</w:t>
+      </w:r>
+    </w:p>
+    <w:p>
+      <w:pPr>
+        <w:spacing w:after="140" w:line="300"/>
+      </w:pPr>
+      <w:r>
+        <w:rPr>
+          <w:rFonts w:ascii="Calibri" w:cs="Calibri" w:eastAsia="Calibri" w:hAnsi="Calibri"/>
+          <w:color w:val="1A1A1A"/>
+          <w:sz w:val="21"/>
+          <w:szCs w:val="21"/>
+        </w:rPr>
+        <w:t xml:space="preserve">Upload de planilha .xlsx, configuração de frequência de importação e regra para cursos não mapeados, com acompanhamento do processamento em segundo plano e resumo da última importação.</w:t>
+      </w:r>
+    </w:p>
+    <w:p>
+      <w:pPr>
+        <w:spacing w:after="80" w:before="200"/>
+        <w:jc w:val="center"/>
+      </w:pPr>
+      <w:r>
+        <w:drawing>
+          <wp:inline distT="0" distB="0" distL="0" distR="0">
+            <wp:extent cx="5715000" cy="3267075"/>
+            <wp:effectExtent t="0" r="0" b="0" l="0"/>
+            <wp:docPr id="1" name="" descr="" title=""/>
+            <wp:cNvGraphicFramePr>
+              <a:graphicFrameLocks xmlns:a="http://schemas.openxmlformats.org/drawingml/2006/main" noChangeAspect="1"/>
+            </wp:cNvGraphicFramePr>
+            <a:graphic xmlns:a="http://schemas.openxmlformats.org/drawingml/2006/main">
+              <a:graphicData uri="http://schemas.openxmlformats.org/drawingml/2006/picture">
+                <pic:pic xmlns:pic="http://schemas.openxmlformats.org/drawingml/2006/picture">
+                  <pic:nvPicPr>
+                    <pic:cNvPr id="0" name="" descr=""/>
+                    <pic:cNvPicPr>
+                      <a:picLocks noChangeAspect="1" noChangeArrowheads="1"/>
+                    </pic:cNvPicPr>
+                  </pic:nvPicPr>
+                  <pic:blipFill>
+                    <a:blip r:embed="rId11" cstate="none"/>
+                    <a:srcRect/>
+                    <a:stretch>
+                      <a:fillRect/>
+                    </a:stretch>
+                  </pic:blipFill>
+                  <pic:spPr bwMode="auto">
+                    <a:xfrm>
+                      <a:off x="0" y="0"/>
+                      <a:ext cx="5715000" cy="3267075"/>
+                    </a:xfrm>
+                    <a:prstGeom prst="rect">
+                      <a:avLst/>
+                    </a:prstGeom>
+                  </pic:spPr>
+                </pic:pic>
+              </a:graphicData>
+            </a:graphic>
+          </wp:inline>
+        </w:drawing>
+      </w:r>
+    </w:p>
+    <w:p>
+      <w:pPr>
+        <w:spacing w:after="260"/>
+        <w:jc w:val="center"/>
+      </w:pPr>
+      <w:r>
+        <w:rPr>
+          <w:rFonts w:ascii="Calibri" w:cs="Calibri" w:eastAsia="Calibri" w:hAnsi="Calibri"/>
+          <w:i/>
+          <w:iCs/>
+          <w:color w:val="595959"/>
+          <w:sz w:val="18"/>
+          <w:szCs w:val="18"/>
+        </w:rPr>
+        <w:t xml:space="preserve">Importação de planilha — upload, configuração e resumo</w:t>
+      </w:r>
+    </w:p>
+    <w:p>
+      <w:pPr>
+        <w:pStyle w:val="Heading3"/>
+        <w:spacing w:after="100" w:before="200"/>
+      </w:pPr>
+      <w:r>
+        <w:rPr>
+          <w:rFonts w:ascii="Calibri" w:cs="Calibri" w:eastAsia="Calibri" w:hAnsi="Calibri"/>
+          <w:b/>
+          <w:bCs/>
+          <w:color w:val="1A1A1A"/>
+          <w:sz w:val="22"/>
+          <w:szCs w:val="22"/>
+        </w:rPr>
+        <w:t xml:space="preserve">24.4 Relatório de Inadimplência</w:t>
+      </w:r>
+    </w:p>
+    <w:p>
+      <w:pPr>
+        <w:spacing w:after="140" w:line="300"/>
+      </w:pPr>
+      <w:r>
+        <w:rPr>
+          <w:rFonts w:ascii="Calibri" w:cs="Calibri" w:eastAsia="Calibri" w:hAnsi="Calibri"/>
+          <w:color w:val="1A1A1A"/>
+          <w:sz w:val="21"/>
+          <w:szCs w:val="21"/>
+        </w:rPr>
+        <w:t xml:space="preserve">Tela de filtros avançados (financeiros, aluno, matrícula e cobrança), com barra de ação em lote para alterar situação, inserir TAGs ou gerar documentos Word para todos os selecionados.</w:t>
+      </w:r>
+    </w:p>
+    <w:p>
+      <w:pPr>
+        <w:spacing w:after="80" w:before="200"/>
+        <w:jc w:val="center"/>
+      </w:pPr>
+      <w:r>
+        <w:drawing>
+          <wp:inline distT="0" distB="0" distL="0" distR="0">
+            <wp:extent cx="5715000" cy="3819525"/>
+            <wp:effectExtent t="0" r="0" b="0" l="0"/>
+            <wp:docPr id="1" name="" descr="" title=""/>
+            <wp:cNvGraphicFramePr>
+              <a:graphicFrameLocks xmlns:a="http://schemas.openxmlformats.org/drawingml/2006/main" noChangeAspect="1"/>
+            </wp:cNvGraphicFramePr>
+            <a:graphic xmlns:a="http://schemas.openxmlformats.org/drawingml/2006/main">
+              <a:graphicData uri="http://schemas.openxmlformats.org/drawingml/2006/picture">
+                <pic:pic xmlns:pic="http://schemas.openxmlformats.org/drawingml/2006/picture">
+                  <pic:nvPicPr>
+                    <pic:cNvPr id="0" name="" descr=""/>
+                    <pic:cNvPicPr>
+                      <a:picLocks noChangeAspect="1" noChangeArrowheads="1"/>
+                    </pic:cNvPicPr>
+                  </pic:nvPicPr>
+                  <pic:blipFill>
+                    <a:blip r:embed="rId12" cstate="none"/>
+                    <a:srcRect/>
+                    <a:stretch>
+                      <a:fillRect/>
+                    </a:stretch>
+                  </pic:blipFill>
+                  <pic:spPr bwMode="auto">
+                    <a:xfrm>
+                      <a:off x="0" y="0"/>
+                      <a:ext cx="5715000" cy="3819525"/>
+                    </a:xfrm>
+                    <a:prstGeom prst="rect">
+                      <a:avLst/>
+                    </a:prstGeom>
+                  </pic:spPr>
+                </pic:pic>
+              </a:graphicData>
+            </a:graphic>
+          </wp:inline>
+        </w:drawing>
+      </w:r>
+    </w:p>
+    <w:p>
+      <w:pPr>
+        <w:spacing w:after="260"/>
+        <w:jc w:val="center"/>
+      </w:pPr>
+      <w:r>
+        <w:rPr>
+          <w:rFonts w:ascii="Calibri" w:cs="Calibri" w:eastAsia="Calibri" w:hAnsi="Calibri"/>
+          <w:i/>
+          <w:iCs/>
+          <w:color w:val="595959"/>
+          <w:sz w:val="18"/>
+          <w:szCs w:val="18"/>
+        </w:rPr>
+        <w:t xml:space="preserve">Relatório de inadimplência — filtros e ação em lote</w:t>
+      </w:r>
+    </w:p>
+    <w:p>
+      <w:pPr>
+        <w:pStyle w:val="Heading3"/>
+        <w:spacing w:after="100" w:before="200"/>
+      </w:pPr>
+      <w:r>
+        <w:rPr>
+          <w:rFonts w:ascii="Calibri" w:cs="Calibri" w:eastAsia="Calibri" w:hAnsi="Calibri"/>
+          <w:b/>
+          <w:bCs/>
+          <w:color w:val="1A1A1A"/>
+          <w:sz w:val="22"/>
+          <w:szCs w:val="22"/>
+        </w:rPr>
+        <w:t xml:space="preserve">24.5 Ficha de Cobrança da Matrícula</w:t>
+      </w:r>
+    </w:p>
+    <w:p>
+      <w:pPr>
+        <w:spacing w:after="140" w:line="300"/>
+      </w:pPr>
+      <w:r>
+        <w:rPr>
+          <w:rFonts w:ascii="Calibri" w:cs="Calibri" w:eastAsia="Calibri" w:hAnsi="Calibri"/>
+          <w:color w:val="1A1A1A"/>
+          <w:sz w:val="21"/>
+          <w:szCs w:val="21"/>
+        </w:rPr>
+        <w:t xml:space="preserve">Núcleo do módulo de CRM de cobrança: situação atual, TAGs, parcelas em aberto, campo de nova observação e linha do tempo com o histórico completo de tratativas.</w:t>
+      </w:r>
+    </w:p>
+    <w:p>
+      <w:pPr>
+        <w:spacing w:after="80" w:before="200"/>
+        <w:jc w:val="center"/>
+      </w:pPr>
+      <w:r>
+        <w:drawing>
+          <wp:inline distT="0" distB="0" distL="0" distR="0">
+            <wp:extent cx="5715000" cy="3514725"/>
+            <wp:effectExtent t="0" r="0" b="0" l="0"/>
+            <wp:docPr id="1" name="" descr="" title=""/>
+            <wp:cNvGraphicFramePr>
+              <a:graphicFrameLocks xmlns:a="http://schemas.openxmlformats.org/drawingml/2006/main" noChangeAspect="1"/>
+            </wp:cNvGraphicFramePr>
+            <a:graphic xmlns:a="http://schemas.openxmlformats.org/drawingml/2006/main">
+              <a:graphicData uri="http://schemas.openxmlformats.org/drawingml/2006/picture">
+                <pic:pic xmlns:pic="http://schemas.openxmlformats.org/drawingml/2006/picture">
+                  <pic:nvPicPr>
+                    <pic:cNvPr id="0" name="" descr=""/>
+                    <pic:cNvPicPr>
+                      <a:picLocks noChangeAspect="1" noChangeArrowheads="1"/>
+                    </pic:cNvPicPr>
+                  </pic:nvPicPr>
+                  <pic:blipFill>
+                    <a:blip r:embed="rId13" cstate="none"/>
+                    <a:srcRect/>
+                    <a:stretch>
+                      <a:fillRect/>
+                    </a:stretch>
+                  </pic:blipFill>
+                  <pic:spPr bwMode="auto">
+                    <a:xfrm>
+                      <a:off x="0" y="0"/>
+                      <a:ext cx="5715000" cy="3514725"/>
+                    </a:xfrm>
+                    <a:prstGeom prst="rect">
+                      <a:avLst/>
+                    </a:prstGeom>
+                  </pic:spPr>
+                </pic:pic>
+              </a:graphicData>
+            </a:graphic>
+          </wp:inline>
+        </w:drawing>
+      </w:r>
+    </w:p>
+    <w:p>
+      <w:pPr>
+        <w:spacing w:after="260"/>
+        <w:jc w:val="center"/>
+      </w:pPr>
+      <w:r>
+        <w:rPr>
+          <w:rFonts w:ascii="Calibri" w:cs="Calibri" w:eastAsia="Calibri" w:hAnsi="Calibri"/>
+          <w:i/>
+          <w:iCs/>
+          <w:color w:val="595959"/>
+          <w:sz w:val="18"/>
+          <w:szCs w:val="18"/>
+        </w:rPr>
+        <w:t xml:space="preserve">Ficha de cobrança — situação, TAGs, observações e histórico</w:t>
+      </w:r>
+    </w:p>
+    <w:p>
+      <w:pPr>
+        <w:pStyle w:val="Heading1"/>
+        <w:pBdr>
+          <w:bottom w:val="single" w:color="2E75B6" w:sz="6" w:space="4"/>
+        </w:pBdr>
+        <w:spacing w:after="200" w:before="480"/>
+      </w:pPr>
+      <w:r>
+        <w:rPr>
+          <w:rFonts w:ascii="Calibri" w:cs="Calibri" w:eastAsia="Calibri" w:hAnsi="Calibri"/>
+          <w:b/>
+          <w:bCs/>
+          <w:color w:val="1F3A5F"/>
+          <w:sz w:val="30"/>
+          <w:szCs w:val="30"/>
+        </w:rPr>
+        <w:t xml:space="preserve">25. </w:t>
+      </w:r>
+      <w:r>
+        <w:rPr>
+          <w:rFonts w:ascii="Calibri" w:cs="Calibri" w:eastAsia="Calibri" w:hAnsi="Calibri"/>
+          <w:b/>
+          <w:bCs/>
+          <w:color w:val="1F3A5F"/>
+          <w:sz w:val="30"/>
+          <w:szCs w:val="30"/>
+        </w:rPr>
         <w:t xml:space="preserve">Arquitetura do Projeto e Estrutura de Pastas</w:t>
       </w:r>
     </w:p>
@@ -16911,7 +17426,7 @@
           <w:sz w:val="30"/>
           <w:szCs w:val="30"/>
         </w:rPr>
-        <w:t xml:space="preserve">25. </w:t>
+        <w:t xml:space="preserve">26. </w:t>
       </w:r>
       <w:r>
         <w:rPr>
@@ -17589,7 +18104,7 @@
           <w:sz w:val="30"/>
           <w:szCs w:val="30"/>
         </w:rPr>
-        <w:t xml:space="preserve">26. </w:t>
+        <w:t xml:space="preserve">27. </w:t>
       </w:r>
       <w:r>
         <w:rPr>

</xml_diff>